<commit_message>
update voor quarto factsheets
</commit_message>
<xml_diff>
--- a/07 quarto/template_warenmarkten.docx
+++ b/07 quarto/template_warenmarkten.docx
@@ -2333,6 +2333,375 @@
         <mc:AlternateContent>
           <mc:Choice Requires="wps">
             <w:drawing>
+              <wp:anchor distT="0" distB="0" distL="114300" distR="114300" simplePos="0" relativeHeight="251668480" behindDoc="0" locked="0" layoutInCell="1" allowOverlap="1" wp14:anchorId="269ACF99" wp14:editId="76E58C75">
+                <wp:simplePos x="0" y="0"/>
+                <wp:positionH relativeFrom="margin">
+                  <wp:posOffset>2701925</wp:posOffset>
+                </wp:positionH>
+                <wp:positionV relativeFrom="paragraph">
+                  <wp:posOffset>4419600</wp:posOffset>
+                </wp:positionV>
+                <wp:extent cx="1349375" cy="1720215"/>
+                <wp:effectExtent l="0" t="0" r="3175" b="13335"/>
+                <wp:wrapNone/>
+                <wp:docPr id="712671489" name="Tekstvak 15" descr="Colofon"/>
+                <wp:cNvGraphicFramePr/>
+                <a:graphic xmlns:a="http://schemas.openxmlformats.org/drawingml/2006/main">
+                  <a:graphicData uri="http://schemas.microsoft.com/office/word/2010/wordprocessingShape">
+                    <wps:wsp>
+                      <wps:cNvSpPr txBox="1"/>
+                      <wps:spPr>
+                        <a:xfrm>
+                          <a:off x="0" y="0"/>
+                          <a:ext cx="1349375" cy="1720215"/>
+                        </a:xfrm>
+                        <a:prstGeom prst="rect">
+                          <a:avLst/>
+                        </a:prstGeom>
+                        <a:noFill/>
+                        <a:ln w="6350">
+                          <a:noFill/>
+                        </a:ln>
+                        <a:effectLst/>
+                      </wps:spPr>
+                      <wps:style>
+                        <a:lnRef idx="0">
+                          <a:schemeClr val="accent1"/>
+                        </a:lnRef>
+                        <a:fillRef idx="0">
+                          <a:schemeClr val="accent1"/>
+                        </a:fillRef>
+                        <a:effectRef idx="0">
+                          <a:schemeClr val="accent1"/>
+                        </a:effectRef>
+                        <a:fontRef idx="minor">
+                          <a:schemeClr val="dk1"/>
+                        </a:fontRef>
+                      </wps:style>
+                      <wps:txbx>
+                        <w:txbxContent>
+                          <w:p>
+                            <w:pPr>
+                              <w:rPr>
+                                <w:color w:val="FFFFFF" w:themeColor="background1"/>
+                                <w:sz w:val="16"/>
+                                <w:szCs w:val="16"/>
+                              </w:rPr>
+                            </w:pPr>
+                            <w:r>
+                              <w:rPr>
+                                <w:b/>
+                                <w:bCs/>
+                                <w:color w:val="FFFFFF" w:themeColor="background1"/>
+                                <w:sz w:val="32"/>
+                                <w:szCs w:val="32"/>
+                              </w:rPr>
+                              <w:t>Colofon</w:t>
+                            </w:r>
+                            <w:r>
+                              <w:rPr>
+                                <w:color w:val="FFFFFF" w:themeColor="background1"/>
+                                <w:sz w:val="32"/>
+                                <w:szCs w:val="32"/>
+                              </w:rPr>
+                              <w:br/>
+                            </w:r>
+                            <w:r>
+                              <w:rPr>
+                                <w:color w:val="FFFFFF" w:themeColor="background1"/>
+                                <w:sz w:val="14"/>
+                                <w:szCs w:val="14"/>
+                              </w:rPr>
+                              <w:br/>
+                            </w:r>
+                            <w:r>
+                              <w:rPr>
+                                <w:b/>
+                                <w:bCs/>
+                                <w:color w:val="FFFFFF" w:themeColor="background1"/>
+                                <w:sz w:val="16"/>
+                                <w:szCs w:val="16"/>
+                              </w:rPr>
+                              <w:t>Opdrachtgever</w:t>
+                            </w:r>
+                            <w:r>
+                              <w:rPr>
+                                <w:b/>
+                                <w:bCs/>
+                                <w:color w:val="FFFFFF" w:themeColor="background1"/>
+                                <w:sz w:val="16"/>
+                                <w:szCs w:val="16"/>
+                              </w:rPr>
+                              <w:br/>
+                            </w:r>
+                            <w:r>
+                              <w:rPr>
+                                <w:color w:val="FFFFFF" w:themeColor="background1"/>
+                                <w:sz w:val="16"/>
+                                <w:szCs w:val="16"/>
+                              </w:rPr>
+                              <w:t>naam opdrachtgever</w:t>
+                            </w:r>
+                            <w:r>
+                              <w:rPr>
+                                <w:color w:val="FFFFFF" w:themeColor="background1"/>
+                                <w:sz w:val="16"/>
+                                <w:szCs w:val="16"/>
+                              </w:rPr>
+                              <w:br/>
+                            </w:r>
+                            <w:r>
+                              <w:rPr>
+                                <w:color w:val="FFFFFF" w:themeColor="background1"/>
+                                <w:sz w:val="16"/>
+                                <w:szCs w:val="16"/>
+                              </w:rPr>
+                              <w:br/>
+                            </w:r>
+                            <w:r>
+                              <w:rPr>
+                                <w:color w:val="FFFFFF" w:themeColor="background1"/>
+                                <w:sz w:val="16"/>
+                                <w:szCs w:val="16"/>
+                              </w:rPr>
+                              <w:br/>
+                            </w:r>
+                            <w:r>
+                              <w:rPr>
+                                <w:color w:val="FFFFFF" w:themeColor="background1"/>
+                                <w:sz w:val="16"/>
+                                <w:szCs w:val="16"/>
+                              </w:rPr>
+                              <w:br/>
+                            </w:r>
+                            <w:r>
+                              <w:rPr>
+                                <w:color w:val="FFFFFF" w:themeColor="background1"/>
+                                <w:sz w:val="16"/>
+                                <w:szCs w:val="16"/>
+                              </w:rPr>
+                              <w:br/>
+                              <w:t>straat nummer</w:t>
+                            </w:r>
+                            <w:r>
+                              <w:rPr>
+                                <w:color w:val="FFFFFF" w:themeColor="background1"/>
+                                <w:sz w:val="16"/>
+                                <w:szCs w:val="16"/>
+                              </w:rPr>
+                              <w:br/>
+                              <w:t>postcode stad</w:t>
+                            </w:r>
+                            <w:r>
+                              <w:rPr>
+                                <w:color w:val="FFFFFF" w:themeColor="background1"/>
+                                <w:sz w:val="16"/>
+                                <w:szCs w:val="16"/>
+                              </w:rPr>
+                              <w:br/>
+                              <w:t>Postbus ????</w:t>
+                            </w:r>
+                          </w:p>
+                          <w:p>
+                            <w:pPr>
+                              <w:rPr>
+                                <w:color w:val="FFFFFF" w:themeColor="background1"/>
+                                <w:sz w:val="22"/>
+                                <w:szCs w:val="22"/>
+                              </w:rPr>
+                            </w:pPr>
+                            <w:r>
+                              <w:rPr>
+                                <w:color w:val="FFFFFF" w:themeColor="background1"/>
+                                <w:sz w:val="16"/>
+                                <w:szCs w:val="16"/>
+                              </w:rPr>
+                              <w:t>postcode stad</w:t>
+                            </w:r>
+                          </w:p>
+                        </w:txbxContent>
+                      </wps:txbx>
+                      <wps:bodyPr rot="0" spcFirstLastPara="0" vertOverflow="overflow" horzOverflow="overflow" vert="horz" wrap="square" lIns="0" tIns="0" rIns="0" bIns="0" numCol="1" spcCol="0" rtlCol="0" fromWordArt="0" anchor="t" anchorCtr="0" forceAA="0" compatLnSpc="1">
+                        <a:prstTxWarp prst="textNoShape">
+                          <a:avLst/>
+                        </a:prstTxWarp>
+                        <a:noAutofit/>
+                      </wps:bodyPr>
+                    </wps:wsp>
+                  </a:graphicData>
+                </a:graphic>
+                <wp14:sizeRelH relativeFrom="margin">
+                  <wp14:pctWidth>0</wp14:pctWidth>
+                </wp14:sizeRelH>
+                <wp14:sizeRelV relativeFrom="margin">
+                  <wp14:pctHeight>0</wp14:pctHeight>
+                </wp14:sizeRelV>
+              </wp:anchor>
+            </w:drawing>
+          </mc:Choice>
+          <mc:Fallback>
+            <w:pict>
+              <v:shapetype w14:anchorId="269ACF99" id="_x0000_t202" coordsize="21600,21600" o:spt="202" path="m,l,21600r21600,l21600,xe">
+                <v:stroke joinstyle="miter"/>
+                <v:path gradientshapeok="t" o:connecttype="rect"/>
+              </v:shapetype>
+              <v:shape id="Tekstvak 15" o:spid="_x0000_s1028" type="#_x0000_t202" alt="Colofon" style="position:absolute;margin-left:212.75pt;margin-top:348pt;width:106.25pt;height:135.45pt;z-index:251668480;visibility:visible;mso-wrap-style:square;mso-width-percent:0;mso-height-percent:0;mso-wrap-distance-left:9pt;mso-wrap-distance-top:0;mso-wrap-distance-right:9pt;mso-wrap-distance-bottom:0;mso-position-horizontal:absolute;mso-position-horizontal-relative:margin;mso-position-vertical:absolute;mso-position-vertical-relative:text;mso-width-percent:0;mso-height-percent:0;mso-width-relative:margin;mso-height-relative:margin;v-text-anchor:top" o:gfxdata="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" filled="f" stroked="f" strokeweight=".5pt">
+                <v:textbox inset="0,0,0,0">
+                  <w:txbxContent>
+                    <w:p>
+                      <w:pPr>
+                        <w:rPr>
+                          <w:color w:val="FFFFFF" w:themeColor="background1"/>
+                          <w:sz w:val="16"/>
+                          <w:szCs w:val="16"/>
+                        </w:rPr>
+                      </w:pPr>
+                      <w:r>
+                        <w:rPr>
+                          <w:b/>
+                          <w:bCs/>
+                          <w:color w:val="FFFFFF" w:themeColor="background1"/>
+                          <w:sz w:val="32"/>
+                          <w:szCs w:val="32"/>
+                        </w:rPr>
+                        <w:t>Colofon</w:t>
+                      </w:r>
+                      <w:r>
+                        <w:rPr>
+                          <w:color w:val="FFFFFF" w:themeColor="background1"/>
+                          <w:sz w:val="32"/>
+                          <w:szCs w:val="32"/>
+                        </w:rPr>
+                        <w:br/>
+                      </w:r>
+                      <w:r>
+                        <w:rPr>
+                          <w:color w:val="FFFFFF" w:themeColor="background1"/>
+                          <w:sz w:val="14"/>
+                          <w:szCs w:val="14"/>
+                        </w:rPr>
+                        <w:br/>
+                      </w:r>
+                      <w:r>
+                        <w:rPr>
+                          <w:b/>
+                          <w:bCs/>
+                          <w:color w:val="FFFFFF" w:themeColor="background1"/>
+                          <w:sz w:val="16"/>
+                          <w:szCs w:val="16"/>
+                        </w:rPr>
+                        <w:t>Opdrachtgever</w:t>
+                      </w:r>
+                      <w:r>
+                        <w:rPr>
+                          <w:b/>
+                          <w:bCs/>
+                          <w:color w:val="FFFFFF" w:themeColor="background1"/>
+                          <w:sz w:val="16"/>
+                          <w:szCs w:val="16"/>
+                        </w:rPr>
+                        <w:br/>
+                      </w:r>
+                      <w:r>
+                        <w:rPr>
+                          <w:color w:val="FFFFFF" w:themeColor="background1"/>
+                          <w:sz w:val="16"/>
+                          <w:szCs w:val="16"/>
+                        </w:rPr>
+                        <w:t>naam opdrachtgever</w:t>
+                      </w:r>
+                      <w:r>
+                        <w:rPr>
+                          <w:color w:val="FFFFFF" w:themeColor="background1"/>
+                          <w:sz w:val="16"/>
+                          <w:szCs w:val="16"/>
+                        </w:rPr>
+                        <w:br/>
+                      </w:r>
+                      <w:r>
+                        <w:rPr>
+                          <w:color w:val="FFFFFF" w:themeColor="background1"/>
+                          <w:sz w:val="16"/>
+                          <w:szCs w:val="16"/>
+                        </w:rPr>
+                        <w:br/>
+                      </w:r>
+                      <w:r>
+                        <w:rPr>
+                          <w:color w:val="FFFFFF" w:themeColor="background1"/>
+                          <w:sz w:val="16"/>
+                          <w:szCs w:val="16"/>
+                        </w:rPr>
+                        <w:br/>
+                      </w:r>
+                      <w:r>
+                        <w:rPr>
+                          <w:color w:val="FFFFFF" w:themeColor="background1"/>
+                          <w:sz w:val="16"/>
+                          <w:szCs w:val="16"/>
+                        </w:rPr>
+                        <w:br/>
+                      </w:r>
+                      <w:r>
+                        <w:rPr>
+                          <w:color w:val="FFFFFF" w:themeColor="background1"/>
+                          <w:sz w:val="16"/>
+                          <w:szCs w:val="16"/>
+                        </w:rPr>
+                        <w:br/>
+                        <w:t>straat nummer</w:t>
+                      </w:r>
+                      <w:r>
+                        <w:rPr>
+                          <w:color w:val="FFFFFF" w:themeColor="background1"/>
+                          <w:sz w:val="16"/>
+                          <w:szCs w:val="16"/>
+                        </w:rPr>
+                        <w:br/>
+                        <w:t>postcode stad</w:t>
+                      </w:r>
+                      <w:r>
+                        <w:rPr>
+                          <w:color w:val="FFFFFF" w:themeColor="background1"/>
+                          <w:sz w:val="16"/>
+                          <w:szCs w:val="16"/>
+                        </w:rPr>
+                        <w:br/>
+                        <w:t>Postbus ????</w:t>
+                      </w:r>
+                    </w:p>
+                    <w:p>
+                      <w:pPr>
+                        <w:rPr>
+                          <w:color w:val="FFFFFF" w:themeColor="background1"/>
+                          <w:sz w:val="22"/>
+                          <w:szCs w:val="22"/>
+                        </w:rPr>
+                      </w:pPr>
+                      <w:r>
+                        <w:rPr>
+                          <w:color w:val="FFFFFF" w:themeColor="background1"/>
+                          <w:sz w:val="16"/>
+                          <w:szCs w:val="16"/>
+                        </w:rPr>
+                        <w:t>postcode stad</w:t>
+                      </w:r>
+                    </w:p>
+                  </w:txbxContent>
+                </v:textbox>
+                <w10:wrap anchorx="margin"/>
+              </v:shape>
+            </w:pict>
+          </mc:Fallback>
+        </mc:AlternateContent>
+      </w:r>
+      <w:r>
+        <w:rPr>
+          <w:noProof/>
+        </w:rPr>
+        <mc:AlternateContent>
+          <mc:Choice Requires="wps">
+            <w:drawing>
               <wp:anchor distT="0" distB="0" distL="114300" distR="114300" simplePos="0" relativeHeight="251654144" behindDoc="0" locked="0" layoutInCell="1" allowOverlap="1" wp14:anchorId="1314A7F8" wp14:editId="05E02FC6">
                 <wp:simplePos x="0" y="0"/>
                 <wp:positionH relativeFrom="column">
@@ -2679,11 +3048,7 @@
           </mc:Choice>
           <mc:Fallback>
             <w:pict>
-              <v:shapetype w14:anchorId="421B2DBB" id="_x0000_t202" coordsize="21600,21600" o:spt="202" path="m,l,21600r21600,l21600,xe">
-                <v:stroke joinstyle="miter"/>
-                <v:path gradientshapeok="t" o:connecttype="rect"/>
-              </v:shapetype>
-              <v:shape id="Tekstvak 15" o:spid="_x0000_s1028" type="#_x0000_t202" alt="Meer informatie" style="position:absolute;margin-left:0;margin-top:348pt;width:212.55pt;height:135.45pt;z-index:251667456;visibility:visible;mso-wrap-style:square;mso-width-percent:0;mso-height-percent:0;mso-wrap-distance-left:9pt;mso-wrap-distance-top:0;mso-wrap-distance-right:9pt;mso-wrap-distance-bottom:0;mso-position-horizontal:absolute;mso-position-horizontal-relative:margin;mso-position-vertical:absolute;mso-position-vertical-relative:text;mso-width-percent:0;mso-height-percent:0;mso-width-relative:margin;mso-height-relative:margin;v-text-anchor:top" o:gfxdata="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" filled="f" stroked="f" strokeweight=".5pt">
+              <v:shape w14:anchorId="421B2DBB" id="_x0000_s1029" type="#_x0000_t202" alt="Meer informatie" style="position:absolute;margin-left:0;margin-top:348pt;width:212.55pt;height:135.45pt;z-index:251667456;visibility:visible;mso-wrap-style:square;mso-width-percent:0;mso-height-percent:0;mso-wrap-distance-left:9pt;mso-wrap-distance-top:0;mso-wrap-distance-right:9pt;mso-wrap-distance-bottom:0;mso-position-horizontal:absolute;mso-position-horizontal-relative:margin;mso-position-vertical:absolute;mso-position-vertical-relative:text;mso-width-percent:0;mso-height-percent:0;mso-width-relative:margin;mso-height-relative:margin;v-text-anchor:top" o:gfxdata="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" filled="f" stroked="f" strokeweight=".5pt">
                 <v:textbox inset="0,0,0,0">
                   <w:txbxContent>
                     <w:p>
@@ -2892,7 +3257,7 @@
         <mc:AlternateContent>
           <mc:Choice Requires="wps">
             <w:drawing>
-              <wp:anchor distT="0" distB="0" distL="114300" distR="114300" simplePos="0" relativeHeight="251669504" behindDoc="0" locked="0" layoutInCell="1" allowOverlap="1" wp14:anchorId="37F48AAD" wp14:editId="3B78DBF3">
+              <wp:anchor distT="0" distB="0" distL="114300" distR="114300" simplePos="0" relativeHeight="251669504" behindDoc="0" locked="0" layoutInCell="1" allowOverlap="1" wp14:anchorId="37F48AAD" wp14:editId="60EC6447">
                 <wp:simplePos x="0" y="0"/>
                 <wp:positionH relativeFrom="margin">
                   <wp:posOffset>4381500</wp:posOffset>
@@ -3147,7 +3512,7 @@
           </mc:Choice>
           <mc:Fallback>
             <w:pict>
-              <v:shape w14:anchorId="37F48AAD" id="_x0000_s1029" type="#_x0000_t202" alt="Onderzoek en Statistiek" style="position:absolute;margin-left:345pt;margin-top:348pt;width:91.25pt;height:135.45pt;z-index:251669504;visibility:visible;mso-wrap-style:square;mso-width-percent:0;mso-height-percent:0;mso-wrap-distance-left:9pt;mso-wrap-distance-top:0;mso-wrap-distance-right:9pt;mso-wrap-distance-bottom:0;mso-position-horizontal:absolute;mso-position-horizontal-relative:margin;mso-position-vertical:absolute;mso-position-vertical-relative:text;mso-width-percent:0;mso-height-percent:0;mso-width-relative:margin;mso-height-relative:margin;v-text-anchor:top" o:gfxdata="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" filled="f" stroked="f" strokeweight=".5pt">
+              <v:shape w14:anchorId="37F48AAD" id="_x0000_s1030" type="#_x0000_t202" alt="Onderzoek en Statistiek" style="position:absolute;margin-left:345pt;margin-top:348pt;width:91.25pt;height:135.45pt;z-index:251669504;visibility:visible;mso-wrap-style:square;mso-width-percent:0;mso-height-percent:0;mso-wrap-distance-left:9pt;mso-wrap-distance-top:0;mso-wrap-distance-right:9pt;mso-wrap-distance-bottom:0;mso-position-horizontal:absolute;mso-position-horizontal-relative:margin;mso-position-vertical:absolute;mso-position-vertical-relative:text;mso-width-percent:0;mso-height-percent:0;mso-width-relative:margin;mso-height-relative:margin;v-text-anchor:top" o:gfxdata="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" filled="f" stroked="f" strokeweight=".5pt">
                 <v:textbox inset="0,0,0,0">
                   <w:txbxContent>
                     <w:p>
@@ -3345,371 +3710,6 @@
         </mc:AlternateContent>
       </w:r>
       <w:r>
-        <w:rPr>
-          <w:noProof/>
-        </w:rPr>
-        <mc:AlternateContent>
-          <mc:Choice Requires="wps">
-            <w:drawing>
-              <wp:anchor distT="0" distB="0" distL="114300" distR="114300" simplePos="0" relativeHeight="251668480" behindDoc="0" locked="0" layoutInCell="1" allowOverlap="1" wp14:anchorId="269ACF99" wp14:editId="1C1ADDA7">
-                <wp:simplePos x="0" y="0"/>
-                <wp:positionH relativeFrom="margin">
-                  <wp:posOffset>2853690</wp:posOffset>
-                </wp:positionH>
-                <wp:positionV relativeFrom="paragraph">
-                  <wp:posOffset>4419600</wp:posOffset>
-                </wp:positionV>
-                <wp:extent cx="1349375" cy="1720215"/>
-                <wp:effectExtent l="0" t="0" r="3175" b="13335"/>
-                <wp:wrapNone/>
-                <wp:docPr id="712671489" name="Tekstvak 15" descr="Colofon"/>
-                <wp:cNvGraphicFramePr/>
-                <a:graphic xmlns:a="http://schemas.openxmlformats.org/drawingml/2006/main">
-                  <a:graphicData uri="http://schemas.microsoft.com/office/word/2010/wordprocessingShape">
-                    <wps:wsp>
-                      <wps:cNvSpPr txBox="1"/>
-                      <wps:spPr>
-                        <a:xfrm>
-                          <a:off x="0" y="0"/>
-                          <a:ext cx="1349375" cy="1720215"/>
-                        </a:xfrm>
-                        <a:prstGeom prst="rect">
-                          <a:avLst/>
-                        </a:prstGeom>
-                        <a:noFill/>
-                        <a:ln w="6350">
-                          <a:noFill/>
-                        </a:ln>
-                        <a:effectLst/>
-                      </wps:spPr>
-                      <wps:style>
-                        <a:lnRef idx="0">
-                          <a:schemeClr val="accent1"/>
-                        </a:lnRef>
-                        <a:fillRef idx="0">
-                          <a:schemeClr val="accent1"/>
-                        </a:fillRef>
-                        <a:effectRef idx="0">
-                          <a:schemeClr val="accent1"/>
-                        </a:effectRef>
-                        <a:fontRef idx="minor">
-                          <a:schemeClr val="dk1"/>
-                        </a:fontRef>
-                      </wps:style>
-                      <wps:txbx>
-                        <w:txbxContent>
-                          <w:p>
-                            <w:pPr>
-                              <w:rPr>
-                                <w:color w:val="FFFFFF" w:themeColor="background1"/>
-                                <w:sz w:val="16"/>
-                                <w:szCs w:val="16"/>
-                              </w:rPr>
-                            </w:pPr>
-                            <w:r>
-                              <w:rPr>
-                                <w:b/>
-                                <w:bCs/>
-                                <w:color w:val="FFFFFF" w:themeColor="background1"/>
-                                <w:sz w:val="32"/>
-                                <w:szCs w:val="32"/>
-                              </w:rPr>
-                              <w:t>Colofon</w:t>
-                            </w:r>
-                            <w:r>
-                              <w:rPr>
-                                <w:color w:val="FFFFFF" w:themeColor="background1"/>
-                                <w:sz w:val="32"/>
-                                <w:szCs w:val="32"/>
-                              </w:rPr>
-                              <w:br/>
-                            </w:r>
-                            <w:r>
-                              <w:rPr>
-                                <w:color w:val="FFFFFF" w:themeColor="background1"/>
-                                <w:sz w:val="14"/>
-                                <w:szCs w:val="14"/>
-                              </w:rPr>
-                              <w:br/>
-                            </w:r>
-                            <w:r>
-                              <w:rPr>
-                                <w:b/>
-                                <w:bCs/>
-                                <w:color w:val="FFFFFF" w:themeColor="background1"/>
-                                <w:sz w:val="16"/>
-                                <w:szCs w:val="16"/>
-                              </w:rPr>
-                              <w:t>Opdrachtgever</w:t>
-                            </w:r>
-                            <w:r>
-                              <w:rPr>
-                                <w:b/>
-                                <w:bCs/>
-                                <w:color w:val="FFFFFF" w:themeColor="background1"/>
-                                <w:sz w:val="16"/>
-                                <w:szCs w:val="16"/>
-                              </w:rPr>
-                              <w:br/>
-                            </w:r>
-                            <w:r>
-                              <w:rPr>
-                                <w:color w:val="FFFFFF" w:themeColor="background1"/>
-                                <w:sz w:val="16"/>
-                                <w:szCs w:val="16"/>
-                              </w:rPr>
-                              <w:t>naam opdrachtgever</w:t>
-                            </w:r>
-                            <w:r>
-                              <w:rPr>
-                                <w:color w:val="FFFFFF" w:themeColor="background1"/>
-                                <w:sz w:val="16"/>
-                                <w:szCs w:val="16"/>
-                              </w:rPr>
-                              <w:br/>
-                            </w:r>
-                            <w:r>
-                              <w:rPr>
-                                <w:color w:val="FFFFFF" w:themeColor="background1"/>
-                                <w:sz w:val="16"/>
-                                <w:szCs w:val="16"/>
-                              </w:rPr>
-                              <w:br/>
-                            </w:r>
-                            <w:r>
-                              <w:rPr>
-                                <w:color w:val="FFFFFF" w:themeColor="background1"/>
-                                <w:sz w:val="16"/>
-                                <w:szCs w:val="16"/>
-                              </w:rPr>
-                              <w:br/>
-                            </w:r>
-                            <w:r>
-                              <w:rPr>
-                                <w:color w:val="FFFFFF" w:themeColor="background1"/>
-                                <w:sz w:val="16"/>
-                                <w:szCs w:val="16"/>
-                              </w:rPr>
-                              <w:br/>
-                            </w:r>
-                            <w:r>
-                              <w:rPr>
-                                <w:color w:val="FFFFFF" w:themeColor="background1"/>
-                                <w:sz w:val="16"/>
-                                <w:szCs w:val="16"/>
-                              </w:rPr>
-                              <w:br/>
-                              <w:t>straat nummer</w:t>
-                            </w:r>
-                            <w:r>
-                              <w:rPr>
-                                <w:color w:val="FFFFFF" w:themeColor="background1"/>
-                                <w:sz w:val="16"/>
-                                <w:szCs w:val="16"/>
-                              </w:rPr>
-                              <w:br/>
-                              <w:t>postcode stad</w:t>
-                            </w:r>
-                            <w:r>
-                              <w:rPr>
-                                <w:color w:val="FFFFFF" w:themeColor="background1"/>
-                                <w:sz w:val="16"/>
-                                <w:szCs w:val="16"/>
-                              </w:rPr>
-                              <w:br/>
-                              <w:t>Postbus ????</w:t>
-                            </w:r>
-                          </w:p>
-                          <w:p>
-                            <w:pPr>
-                              <w:rPr>
-                                <w:color w:val="FFFFFF" w:themeColor="background1"/>
-                                <w:sz w:val="22"/>
-                                <w:szCs w:val="22"/>
-                              </w:rPr>
-                            </w:pPr>
-                            <w:r>
-                              <w:rPr>
-                                <w:color w:val="FFFFFF" w:themeColor="background1"/>
-                                <w:sz w:val="16"/>
-                                <w:szCs w:val="16"/>
-                              </w:rPr>
-                              <w:t>postcode stad</w:t>
-                            </w:r>
-                          </w:p>
-                        </w:txbxContent>
-                      </wps:txbx>
-                      <wps:bodyPr rot="0" spcFirstLastPara="0" vertOverflow="overflow" horzOverflow="overflow" vert="horz" wrap="square" lIns="0" tIns="0" rIns="0" bIns="0" numCol="1" spcCol="0" rtlCol="0" fromWordArt="0" anchor="t" anchorCtr="0" forceAA="0" compatLnSpc="1">
-                        <a:prstTxWarp prst="textNoShape">
-                          <a:avLst/>
-                        </a:prstTxWarp>
-                        <a:noAutofit/>
-                      </wps:bodyPr>
-                    </wps:wsp>
-                  </a:graphicData>
-                </a:graphic>
-                <wp14:sizeRelH relativeFrom="margin">
-                  <wp14:pctWidth>0</wp14:pctWidth>
-                </wp14:sizeRelH>
-                <wp14:sizeRelV relativeFrom="margin">
-                  <wp14:pctHeight>0</wp14:pctHeight>
-                </wp14:sizeRelV>
-              </wp:anchor>
-            </w:drawing>
-          </mc:Choice>
-          <mc:Fallback>
-            <w:pict>
-              <v:shape w14:anchorId="269ACF99" id="_x0000_s1030" type="#_x0000_t202" alt="Colofon" style="position:absolute;margin-left:224.7pt;margin-top:348pt;width:106.25pt;height:135.45pt;z-index:251668480;visibility:visible;mso-wrap-style:square;mso-width-percent:0;mso-height-percent:0;mso-wrap-distance-left:9pt;mso-wrap-distance-top:0;mso-wrap-distance-right:9pt;mso-wrap-distance-bottom:0;mso-position-horizontal:absolute;mso-position-horizontal-relative:margin;mso-position-vertical:absolute;mso-position-vertical-relative:text;mso-width-percent:0;mso-height-percent:0;mso-width-relative:margin;mso-height-relative:margin;v-text-anchor:top" o:gfxdata="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" filled="f" stroked="f" strokeweight=".5pt">
-                <v:textbox inset="0,0,0,0">
-                  <w:txbxContent>
-                    <w:p>
-                      <w:pPr>
-                        <w:rPr>
-                          <w:color w:val="FFFFFF" w:themeColor="background1"/>
-                          <w:sz w:val="16"/>
-                          <w:szCs w:val="16"/>
-                        </w:rPr>
-                      </w:pPr>
-                      <w:r>
-                        <w:rPr>
-                          <w:b/>
-                          <w:bCs/>
-                          <w:color w:val="FFFFFF" w:themeColor="background1"/>
-                          <w:sz w:val="32"/>
-                          <w:szCs w:val="32"/>
-                        </w:rPr>
-                        <w:t>Colofon</w:t>
-                      </w:r>
-                      <w:r>
-                        <w:rPr>
-                          <w:color w:val="FFFFFF" w:themeColor="background1"/>
-                          <w:sz w:val="32"/>
-                          <w:szCs w:val="32"/>
-                        </w:rPr>
-                        <w:br/>
-                      </w:r>
-                      <w:r>
-                        <w:rPr>
-                          <w:color w:val="FFFFFF" w:themeColor="background1"/>
-                          <w:sz w:val="14"/>
-                          <w:szCs w:val="14"/>
-                        </w:rPr>
-                        <w:br/>
-                      </w:r>
-                      <w:r>
-                        <w:rPr>
-                          <w:b/>
-                          <w:bCs/>
-                          <w:color w:val="FFFFFF" w:themeColor="background1"/>
-                          <w:sz w:val="16"/>
-                          <w:szCs w:val="16"/>
-                        </w:rPr>
-                        <w:t>Opdrachtgever</w:t>
-                      </w:r>
-                      <w:r>
-                        <w:rPr>
-                          <w:b/>
-                          <w:bCs/>
-                          <w:color w:val="FFFFFF" w:themeColor="background1"/>
-                          <w:sz w:val="16"/>
-                          <w:szCs w:val="16"/>
-                        </w:rPr>
-                        <w:br/>
-                      </w:r>
-                      <w:r>
-                        <w:rPr>
-                          <w:color w:val="FFFFFF" w:themeColor="background1"/>
-                          <w:sz w:val="16"/>
-                          <w:szCs w:val="16"/>
-                        </w:rPr>
-                        <w:t>naam opdrachtgever</w:t>
-                      </w:r>
-                      <w:r>
-                        <w:rPr>
-                          <w:color w:val="FFFFFF" w:themeColor="background1"/>
-                          <w:sz w:val="16"/>
-                          <w:szCs w:val="16"/>
-                        </w:rPr>
-                        <w:br/>
-                      </w:r>
-                      <w:r>
-                        <w:rPr>
-                          <w:color w:val="FFFFFF" w:themeColor="background1"/>
-                          <w:sz w:val="16"/>
-                          <w:szCs w:val="16"/>
-                        </w:rPr>
-                        <w:br/>
-                      </w:r>
-                      <w:r>
-                        <w:rPr>
-                          <w:color w:val="FFFFFF" w:themeColor="background1"/>
-                          <w:sz w:val="16"/>
-                          <w:szCs w:val="16"/>
-                        </w:rPr>
-                        <w:br/>
-                      </w:r>
-                      <w:r>
-                        <w:rPr>
-                          <w:color w:val="FFFFFF" w:themeColor="background1"/>
-                          <w:sz w:val="16"/>
-                          <w:szCs w:val="16"/>
-                        </w:rPr>
-                        <w:br/>
-                      </w:r>
-                      <w:r>
-                        <w:rPr>
-                          <w:color w:val="FFFFFF" w:themeColor="background1"/>
-                          <w:sz w:val="16"/>
-                          <w:szCs w:val="16"/>
-                        </w:rPr>
-                        <w:br/>
-                        <w:t>straat nummer</w:t>
-                      </w:r>
-                      <w:r>
-                        <w:rPr>
-                          <w:color w:val="FFFFFF" w:themeColor="background1"/>
-                          <w:sz w:val="16"/>
-                          <w:szCs w:val="16"/>
-                        </w:rPr>
-                        <w:br/>
-                        <w:t>postcode stad</w:t>
-                      </w:r>
-                      <w:r>
-                        <w:rPr>
-                          <w:color w:val="FFFFFF" w:themeColor="background1"/>
-                          <w:sz w:val="16"/>
-                          <w:szCs w:val="16"/>
-                        </w:rPr>
-                        <w:br/>
-                        <w:t>Postbus ????</w:t>
-                      </w:r>
-                    </w:p>
-                    <w:p>
-                      <w:pPr>
-                        <w:rPr>
-                          <w:color w:val="FFFFFF" w:themeColor="background1"/>
-                          <w:sz w:val="22"/>
-                          <w:szCs w:val="22"/>
-                        </w:rPr>
-                      </w:pPr>
-                      <w:r>
-                        <w:rPr>
-                          <w:color w:val="FFFFFF" w:themeColor="background1"/>
-                          <w:sz w:val="16"/>
-                          <w:szCs w:val="16"/>
-                        </w:rPr>
-                        <w:t>postcode stad</w:t>
-                      </w:r>
-                    </w:p>
-                  </w:txbxContent>
-                </v:textbox>
-                <w10:wrap anchorx="margin"/>
-              </v:shape>
-            </w:pict>
-          </mc:Fallback>
-        </mc:AlternateContent>
-      </w:r>
-      <w:r>
         <w:t>Opmerkingen of ideeën over deze template? Geef ze door aan de redactie!</w:t>
       </w:r>
       <w:r>
@@ -3872,7 +3872,7 @@
             <w:szCs w:val="20"/>
             <w:lang w:val="en-GB"/>
           </w:rPr>
-          <w:instrText>4</w:instrText>
+          <w:instrText>6</w:instrText>
         </w:r>
         <w:r>
           <w:rPr>
@@ -3990,7 +3990,7 @@
             <w:szCs w:val="20"/>
             <w:lang w:val="en-GB"/>
           </w:rPr>
-          <w:instrText>4</w:instrText>
+          <w:instrText>5</w:instrText>
         </w:r>
         <w:r>
           <w:rPr>
@@ -3999,22 +3999,6 @@
             <w:lang w:val="en-GB"/>
           </w:rPr>
           <w:fldChar w:fldCharType="end"/>
-        </w:r>
-        <w:r>
-          <w:rPr>
-            <w:sz w:val="20"/>
-            <w:szCs w:val="20"/>
-          </w:rPr>
-          <w:fldChar w:fldCharType="separate"/>
-        </w:r>
-        <w:r>
-          <w:rPr>
-            <w:noProof/>
-            <w:sz w:val="20"/>
-            <w:szCs w:val="20"/>
-            <w:lang w:val="en-GB"/>
-          </w:rPr>
-          <w:t>4</w:t>
         </w:r>
         <w:r>
           <w:rPr>
@@ -4341,7 +4325,7 @@
       <w:tab/>
     </w:r>
     <w:r>
-      <w:t>De titel van deze korte rapportage</w:t>
+      <w:t>Monitor Warenmarkten 2025</w:t>
     </w:r>
   </w:p>
   <w:p>
@@ -7448,7 +7432,7 @@
     <w:basedOn w:val="introblauwkader"/>
     <w:link w:val="3IntrotekstChar"/>
     <w:qFormat/>
-    <w:rsid w:val="00CB6C4F"/>
+    <w:rsid w:val="000E6038"/>
     <w:pPr>
       <w:shd w:val="clear" w:color="auto" w:fill="004699"/>
       <w:mirrorIndents/>
@@ -7488,8 +7472,9 @@
     <w:name w:val="3 Introtekst Char"/>
     <w:basedOn w:val="introblauwkaderChar"/>
     <w:link w:val="3Introtekst"/>
-    <w:rsid w:val="00CB6C4F"/>
+    <w:rsid w:val="000E6038"/>
     <w:rPr>
+      <w:rFonts w:ascii="Amsterdam Sans" w:hAnsi="Amsterdam Sans"/>
       <w:b/>
       <w:color w:val="FFFFFF" w:themeColor="background1"/>
       <w:sz w:val="24"/>
@@ -7636,7 +7621,7 @@
     <w:name w:val="Tekstvak grijs"/>
     <w:basedOn w:val="Standaard"/>
     <w:qFormat/>
-    <w:rsid w:val="00902AA3"/>
+    <w:rsid w:val="00D52AED"/>
     <w:pPr>
       <w:pBdr>
         <w:top w:val="single" w:sz="48" w:space="1" w:color="D9D9D9" w:themeColor="background1" w:themeShade="D9"/>
@@ -7645,7 +7630,7 @@
         <w:right w:val="single" w:sz="48" w:space="1" w:color="D9D9D9" w:themeColor="background1" w:themeShade="D9"/>
       </w:pBdr>
       <w:shd w:val="clear" w:color="auto" w:fill="D9D9D9" w:themeFill="background1" w:themeFillShade="D9"/>
-      <w:ind w:left="709" w:right="170"/>
+      <w:ind w:right="170"/>
     </w:pPr>
     <w:rPr>
       <w:i/>
@@ -8393,36 +8378,6 @@
 </file>
 
 <file path=customXml/item1.xml><?xml version="1.0" encoding="utf-8"?>
-<?mso-contentType ?>
-<FormTemplates xmlns="http://schemas.microsoft.com/sharepoint/v3/contenttype/forms">
-  <Display>DocumentLibraryForm</Display>
-  <Edit>DocumentLibraryForm</Edit>
-  <New>DocumentLibraryForm</New>
-</FormTemplates>
-</file>
-
-<file path=customXml/item2.xml><?xml version="1.0" encoding="utf-8"?>
-<b:Sources xmlns:b="http://schemas.openxmlformats.org/officeDocument/2006/bibliography" xmlns="http://schemas.openxmlformats.org/officeDocument/2006/bibliography" SelectedStyle="\APA.XSL" StyleName="APA"/>
-</file>
-
-<file path=customXml/item3.xml><?xml version="1.0" encoding="utf-8"?>
-<p:properties xmlns:p="http://schemas.microsoft.com/office/2006/metadata/properties" xmlns:xsi="http://www.w3.org/2001/XMLSchema-instance" xmlns:pc="http://schemas.microsoft.com/office/infopath/2007/PartnerControls">
-  <documentManagement>
-    <_dlc_DocId xmlns="f4c2603e-519f-4665-82e2-ce6dece39bd2">U2C65YR22MK2-1659662025-170786</_dlc_DocId>
-    <lcf76f155ced4ddcb4097134ff3c332f xmlns="0dad2b92-1f54-452b-975a-c65a54c6b77b">
-      <Terms xmlns="http://schemas.microsoft.com/office/infopath/2007/PartnerControls"/>
-    </lcf76f155ced4ddcb4097134ff3c332f>
-    <TaxCatchAll xmlns="451ceeed-c77b-4a37-aea6-85893f5a9fb4" xsi:nil="true"/>
-    <_dlc_DocIdUrl xmlns="f4c2603e-519f-4665-82e2-ce6dece39bd2">
-      <Url>https://hoofdstad.sharepoint.com/sites/SW-DII-DATA-DAFDOES/_layouts/15/DocIdRedir.aspx?ID=U2C65YR22MK2-1659662025-170786</Url>
-      <Description>U2C65YR22MK2-1659662025-170786</Description>
-    </_dlc_DocIdUrl>
-    <alias xmlns="0dad2b92-1f54-452b-975a-c65a54c6b77b" xsi:nil="true"/>
-  </documentManagement>
-</p:properties>
-</file>
-
-<file path=customXml/item4.xml><?xml version="1.0" encoding="utf-8"?>
 <ct:contentTypeSchema xmlns:ct="http://schemas.microsoft.com/office/2006/metadata/contentType" xmlns:ma="http://schemas.microsoft.com/office/2006/metadata/properties/metaAttributes" ct:_="" ma:_="" ma:contentTypeName="Document" ma:contentTypeID="0x010100B3CC09184AF25148B5CD0B95896DFFC2" ma:contentTypeVersion="19" ma:contentTypeDescription="Een nieuw document maken." ma:contentTypeScope="" ma:versionID="718e84533b6e0a779b1b1d0406faa22e">
   <xsd:schema xmlns:xsd="http://www.w3.org/2001/XMLSchema" xmlns:xs="http://www.w3.org/2001/XMLSchema" xmlns:p="http://schemas.microsoft.com/office/2006/metadata/properties" xmlns:ns2="0dad2b92-1f54-452b-975a-c65a54c6b77b" xmlns:ns3="f4c2603e-519f-4665-82e2-ce6dece39bd2" xmlns:ns4="451ceeed-c77b-4a37-aea6-85893f5a9fb4" targetNamespace="http://schemas.microsoft.com/office/2006/metadata/properties" ma:root="true" ma:fieldsID="8955a1fc162575db14501cd582d64965" ns2:_="" ns3:_="" ns4:_="">
     <xsd:import namespace="0dad2b92-1f54-452b-975a-c65a54c6b77b"/>
@@ -8695,7 +8650,7 @@
 </ct:contentTypeSchema>
 </file>
 
-<file path=customXml/item5.xml><?xml version="1.0" encoding="utf-8"?>
+<file path=customXml/item2.xml><?xml version="1.0" encoding="utf-8"?>
 <?mso-contentType ?>
 <spe:Receivers xmlns:spe="http://schemas.microsoft.com/sharepoint/events">
   <Receiver>
@@ -8745,35 +8700,37 @@
 </spe:Receivers>
 </file>
 
-<file path=customXml/itemProps1.xml><?xml version="1.0" encoding="utf-8"?>
-<ds:datastoreItem xmlns:ds="http://schemas.openxmlformats.org/officeDocument/2006/customXml" ds:itemID="{D2863F55-B8CF-4DD2-83E5-E925517809E1}">
-  <ds:schemaRefs>
-    <ds:schemaRef ds:uri="http://schemas.microsoft.com/sharepoint/v3/contenttype/forms"/>
-  </ds:schemaRefs>
-</ds:datastoreItem>
+<file path=customXml/item3.xml><?xml version="1.0" encoding="utf-8"?>
+<?mso-contentType ?>
+<FormTemplates xmlns="http://schemas.microsoft.com/sharepoint/v3/contenttype/forms">
+  <Display>DocumentLibraryForm</Display>
+  <Edit>DocumentLibraryForm</Edit>
+  <New>DocumentLibraryForm</New>
+</FormTemplates>
 </file>
 
-<file path=customXml/itemProps2.xml><?xml version="1.0" encoding="utf-8"?>
-<ds:datastoreItem xmlns:ds="http://schemas.openxmlformats.org/officeDocument/2006/customXml" ds:itemID="{03FB5BE3-51AB-4CEE-B6C2-36590B5D0C53}">
-  <ds:schemaRefs>
-    <ds:schemaRef ds:uri="http://schemas.openxmlformats.org/officeDocument/2006/bibliography"/>
-  </ds:schemaRefs>
-</ds:datastoreItem>
+<file path=customXml/item4.xml><?xml version="1.0" encoding="utf-8"?>
+<b:Sources xmlns:b="http://schemas.openxmlformats.org/officeDocument/2006/bibliography" xmlns="http://schemas.openxmlformats.org/officeDocument/2006/bibliography" SelectedStyle="\APA.XSL" StyleName="APA"/>
 </file>
 
-<file path=customXml/itemProps3.xml><?xml version="1.0" encoding="utf-8"?>
-<ds:datastoreItem xmlns:ds="http://schemas.openxmlformats.org/officeDocument/2006/customXml" ds:itemID="{2373D819-6CD1-4727-90DF-C71D06DE649F}">
-  <ds:schemaRefs>
-    <ds:schemaRef ds:uri="http://schemas.microsoft.com/office/2006/metadata/properties"/>
-    <ds:schemaRef ds:uri="http://schemas.microsoft.com/office/infopath/2007/PartnerControls"/>
-    <ds:schemaRef ds:uri="f4c2603e-519f-4665-82e2-ce6dece39bd2"/>
-    <ds:schemaRef ds:uri="0dad2b92-1f54-452b-975a-c65a54c6b77b"/>
-    <ds:schemaRef ds:uri="451ceeed-c77b-4a37-aea6-85893f5a9fb4"/>
-  </ds:schemaRefs>
-</ds:datastoreItem>
+<file path=customXml/item5.xml><?xml version="1.0" encoding="utf-8"?>
+<p:properties xmlns:p="http://schemas.microsoft.com/office/2006/metadata/properties" xmlns:xsi="http://www.w3.org/2001/XMLSchema-instance" xmlns:pc="http://schemas.microsoft.com/office/infopath/2007/PartnerControls">
+  <documentManagement>
+    <_dlc_DocId xmlns="f4c2603e-519f-4665-82e2-ce6dece39bd2">U2C65YR22MK2-1659662025-170786</_dlc_DocId>
+    <lcf76f155ced4ddcb4097134ff3c332f xmlns="0dad2b92-1f54-452b-975a-c65a54c6b77b">
+      <Terms xmlns="http://schemas.microsoft.com/office/infopath/2007/PartnerControls"/>
+    </lcf76f155ced4ddcb4097134ff3c332f>
+    <TaxCatchAll xmlns="451ceeed-c77b-4a37-aea6-85893f5a9fb4" xsi:nil="true"/>
+    <_dlc_DocIdUrl xmlns="f4c2603e-519f-4665-82e2-ce6dece39bd2">
+      <Url>https://hoofdstad.sharepoint.com/sites/SW-DII-DATA-DAFDOES/_layouts/15/DocIdRedir.aspx?ID=U2C65YR22MK2-1659662025-170786</Url>
+      <Description>U2C65YR22MK2-1659662025-170786</Description>
+    </_dlc_DocIdUrl>
+    <alias xmlns="0dad2b92-1f54-452b-975a-c65a54c6b77b" xsi:nil="true"/>
+  </documentManagement>
+</p:properties>
 </file>
 
-<file path=customXml/itemProps4.xml><?xml version="1.0" encoding="utf-8"?>
+<file path=customXml/itemProps1.xml><?xml version="1.0" encoding="utf-8"?>
 <ds:datastoreItem xmlns:ds="http://schemas.openxmlformats.org/officeDocument/2006/customXml" ds:itemID="{F6270235-C0B5-436D-91BA-86E0867A440D}">
   <ds:schemaRefs>
     <ds:schemaRef ds:uri="http://schemas.microsoft.com/office/2006/metadata/contentType"/>
@@ -8793,10 +8750,38 @@
 </ds:datastoreItem>
 </file>
 
-<file path=customXml/itemProps5.xml><?xml version="1.0" encoding="utf-8"?>
+<file path=customXml/itemProps2.xml><?xml version="1.0" encoding="utf-8"?>
 <ds:datastoreItem xmlns:ds="http://schemas.openxmlformats.org/officeDocument/2006/customXml" ds:itemID="{0BF4A88D-26D7-4EFC-9C56-9B31FB4D047A}">
   <ds:schemaRefs>
     <ds:schemaRef ds:uri="http://schemas.microsoft.com/sharepoint/events"/>
   </ds:schemaRefs>
 </ds:datastoreItem>
+</file>
+
+<file path=customXml/itemProps3.xml><?xml version="1.0" encoding="utf-8"?>
+<ds:datastoreItem xmlns:ds="http://schemas.openxmlformats.org/officeDocument/2006/customXml" ds:itemID="{D2863F55-B8CF-4DD2-83E5-E925517809E1}">
+  <ds:schemaRefs>
+    <ds:schemaRef ds:uri="http://schemas.microsoft.com/sharepoint/v3/contenttype/forms"/>
+  </ds:schemaRefs>
+</ds:datastoreItem>
+</file>
+
+<file path=customXml/itemProps4.xml><?xml version="1.0" encoding="utf-8"?>
+<ds:datastoreItem xmlns:ds="http://schemas.openxmlformats.org/officeDocument/2006/customXml" ds:itemID="{03FB5BE3-51AB-4CEE-B6C2-36590B5D0C53}">
+  <ds:schemaRefs>
+    <ds:schemaRef ds:uri="http://schemas.openxmlformats.org/officeDocument/2006/bibliography"/>
+  </ds:schemaRefs>
+</ds:datastoreItem>
+</file>
+
+<file path=customXml/itemProps5.xml><?xml version="1.0" encoding="utf-8"?>
+<ds:datastoreItem xmlns:ds="http://schemas.openxmlformats.org/officeDocument/2006/customXml" ds:itemID="{2373D819-6CD1-4727-90DF-C71D06DE649F}">
+  <ds:schemaRefs>
+    <ds:schemaRef ds:uri="http://schemas.microsoft.com/office/2006/metadata/properties"/>
+    <ds:schemaRef ds:uri="http://schemas.microsoft.com/office/infopath/2007/PartnerControls"/>
+    <ds:schemaRef ds:uri="f4c2603e-519f-4665-82e2-ce6dece39bd2"/>
+    <ds:schemaRef ds:uri="0dad2b92-1f54-452b-975a-c65a54c6b77b"/>
+    <ds:schemaRef ds:uri="451ceeed-c77b-4a37-aea6-85893f5a9fb4"/>
+  </ds:schemaRefs>
+</ds:datastoreItem>
 </file>
</xml_diff>